<commit_message>
Finalizacion de la pagina web
</commit_message>
<xml_diff>
--- a/TIFC2DEV-AD-07 - Lab_ AD-07_ El Sitio del Blog_Instrucciones para Participantes.docx
+++ b/TIFC2DEV-AD-07 - Lab_ AD-07_ El Sitio del Blog_Instrucciones para Participantes.docx
@@ -1040,14 +1040,23 @@
               <w:rPr>
                 <w:b/>
                 <w:color w:val="0E101A"/>
+                <w:highlight w:val="yellow"/>
               </w:rPr>
               <w:t>Tarea 1</w:t>
             </w:r>
             <w:r>
               <w:rPr>
                 <w:color w:val="0E101A"/>
-              </w:rPr>
-              <w:t>: Volviendo al proyecto " El Sitio del Blog " o haciendo un nuevo repositorio</w:t>
+                <w:highlight w:val="yellow"/>
+              </w:rPr>
+              <w:t xml:space="preserve">: Volviendo al proyecto " El Sitio del Blog " o </w:t>
+            </w:r>
+            <w:r>
+              <w:rPr>
+                <w:color w:val="0E101A"/>
+                <w:highlight w:val="green"/>
+              </w:rPr>
+              <w:t>haciendo un nuevo repositorio</w:t>
             </w:r>
             <w:r>
               <w:rPr>
@@ -1055,26 +1064,42 @@
               </w:rPr>
               <w:t xml:space="preserve">  </w:t>
             </w:r>
-            <w:r>
-              <w:rPr>
-                <w:color w:val="0E101A"/>
-              </w:rPr>
-              <w:sym w:font="Wingdings" w:char="F0E0"/>
-            </w:r>
-            <w:r>
-              <w:rPr>
-                <w:color w:val="0E101A"/>
-              </w:rPr>
-              <w:t xml:space="preserve"> es la misma carpeta de </w:t>
-            </w:r>
-            <w:proofErr w:type="spellStart"/>
-            <w:r>
-              <w:rPr>
-                <w:color w:val="0E101A"/>
-              </w:rPr>
-              <w:t>abc</w:t>
-            </w:r>
-            <w:proofErr w:type="spellEnd"/>
+          </w:p>
+          <w:p>
+            <w:pPr>
+              <w:pStyle w:val="ListParagraph"/>
+              <w:numPr>
+                <w:ilvl w:val="0"/>
+                <w:numId w:val="10"/>
+              </w:numPr>
+              <w:rPr>
+                <w:color w:val="0E101A"/>
+              </w:rPr>
+            </w:pPr>
+            <w:r>
+              <w:rPr>
+                <w:color w:val="0E101A"/>
+              </w:rPr>
+              <w:t>Encuentre su proyecto previo de su lección llamado "TIFC2DEV-SDPF6 Simulación de Proyecto SCRUM" en GitHub.</w:t>
+            </w:r>
+          </w:p>
+          <w:p>
+            <w:pPr>
+              <w:numPr>
+                <w:ilvl w:val="1"/>
+                <w:numId w:val="8"/>
+              </w:numPr>
+              <w:rPr>
+                <w:color w:val="0E101A"/>
+              </w:rPr>
+            </w:pPr>
+            <w:r>
+              <w:rPr>
+                <w:color w:val="0E101A"/>
+              </w:rPr>
+              <w:lastRenderedPageBreak/>
+              <w:t>Si este grupo está creando un nuevo repositorio, rescate cualquier repositorio que pueda haber existido</w:t>
+            </w:r>
           </w:p>
           <w:p>
             <w:pPr>
@@ -1090,41 +1115,6 @@
               <w:rPr>
                 <w:color w:val="0E101A"/>
               </w:rPr>
-              <w:t>Encuentre su proyecto previo de su lección llamado "TIFC2DEV-SDPF6 Simulación de Proyecto SCRUM" en GitHub.</w:t>
-            </w:r>
-          </w:p>
-          <w:p>
-            <w:pPr>
-              <w:numPr>
-                <w:ilvl w:val="1"/>
-                <w:numId w:val="8"/>
-              </w:numPr>
-              <w:rPr>
-                <w:color w:val="0E101A"/>
-              </w:rPr>
-            </w:pPr>
-            <w:r>
-              <w:rPr>
-                <w:color w:val="0E101A"/>
-              </w:rPr>
-              <w:lastRenderedPageBreak/>
-              <w:t>Si este grupo está creando un nuevo repositorio, rescate cualquier repositorio que pueda haber existido</w:t>
-            </w:r>
-          </w:p>
-          <w:p>
-            <w:pPr>
-              <w:numPr>
-                <w:ilvl w:val="0"/>
-                <w:numId w:val="8"/>
-              </w:numPr>
-              <w:rPr>
-                <w:color w:val="0E101A"/>
-              </w:rPr>
-            </w:pPr>
-            <w:r>
-              <w:rPr>
-                <w:color w:val="0E101A"/>
-              </w:rPr>
               <w:t xml:space="preserve">Asegúrese de que su </w:t>
             </w:r>
             <w:proofErr w:type="spellStart"/>
@@ -1174,12 +1164,14 @@
               <w:rPr>
                 <w:b/>
                 <w:color w:val="0E101A"/>
+                <w:highlight w:val="yellow"/>
               </w:rPr>
               <w:t>Tarea 2</w:t>
             </w:r>
             <w:r>
               <w:rPr>
                 <w:color w:val="0E101A"/>
+                <w:highlight w:val="yellow"/>
               </w:rPr>
               <w:t>: Complete su Backlog y añada más tareas según sea necesario</w:t>
             </w:r>
@@ -1192,11 +1184,13 @@
               </w:numPr>
               <w:rPr>
                 <w:color w:val="0E101A"/>
-              </w:rPr>
-            </w:pPr>
-            <w:r>
-              <w:rPr>
-                <w:color w:val="0E101A"/>
+                <w:highlight w:val="yellow"/>
+              </w:rPr>
+            </w:pPr>
+            <w:r>
+              <w:rPr>
+                <w:color w:val="0E101A"/>
+                <w:highlight w:val="yellow"/>
               </w:rPr>
               <w:t>Asignar Tarjetas y Problemas relacionados con sus tareas con una mentalidad SCRUM.</w:t>
             </w:r>
@@ -1209,11 +1203,13 @@
               </w:numPr>
               <w:rPr>
                 <w:color w:val="0E101A"/>
-              </w:rPr>
-            </w:pPr>
-            <w:r>
-              <w:rPr>
-                <w:color w:val="0E101A"/>
+                <w:highlight w:val="yellow"/>
+              </w:rPr>
+            </w:pPr>
+            <w:r>
+              <w:rPr>
+                <w:color w:val="0E101A"/>
+                <w:highlight w:val="yellow"/>
               </w:rPr>
               <w:t>Las tarjetas y los problemas deben pertenecer a la tarea y a sus subtareas.</w:t>
             </w:r>
@@ -1226,11 +1222,13 @@
               </w:numPr>
               <w:rPr>
                 <w:color w:val="0E101A"/>
-              </w:rPr>
-            </w:pPr>
-            <w:r>
-              <w:rPr>
-                <w:color w:val="0E101A"/>
+                <w:highlight w:val="yellow"/>
+              </w:rPr>
+            </w:pPr>
+            <w:r>
+              <w:rPr>
+                <w:color w:val="0E101A"/>
+                <w:highlight w:val="yellow"/>
               </w:rPr>
               <w:t>Se concederán todos los puntos siempre que se hayan enumerado todas las tareas.</w:t>
             </w:r>
@@ -1243,11 +1241,13 @@
               </w:numPr>
               <w:rPr>
                 <w:color w:val="0E101A"/>
-              </w:rPr>
-            </w:pPr>
-            <w:r>
-              <w:rPr>
-                <w:color w:val="0E101A"/>
+                <w:highlight w:val="yellow"/>
+              </w:rPr>
+            </w:pPr>
+            <w:r>
+              <w:rPr>
+                <w:color w:val="0E101A"/>
+                <w:highlight w:val="yellow"/>
               </w:rPr>
               <w:t>Tarea 1 - 7</w:t>
             </w:r>
@@ -1264,18 +1264,21 @@
             <w:pPr>
               <w:rPr>
                 <w:color w:val="0E101A"/>
-              </w:rPr>
-            </w:pPr>
-            <w:r>
-              <w:rPr>
-                <w:b/>
-                <w:color w:val="0E101A"/>
+                <w:highlight w:val="yellow"/>
+              </w:rPr>
+            </w:pPr>
+            <w:r>
+              <w:rPr>
+                <w:b/>
+                <w:color w:val="0E101A"/>
+                <w:highlight w:val="yellow"/>
               </w:rPr>
               <w:t>Tarea 3</w:t>
             </w:r>
             <w:r>
               <w:rPr>
                 <w:color w:val="0E101A"/>
+                <w:highlight w:val="yellow"/>
               </w:rPr>
               <w:t>: Un menú de navegación funcional</w:t>
             </w:r>
@@ -1288,11 +1291,13 @@
               </w:numPr>
               <w:rPr>
                 <w:color w:val="0E101A"/>
-              </w:rPr>
-            </w:pPr>
-            <w:r>
-              <w:rPr>
-                <w:color w:val="0E101A"/>
+                <w:highlight w:val="yellow"/>
+              </w:rPr>
+            </w:pPr>
+            <w:r>
+              <w:rPr>
+                <w:color w:val="0E101A"/>
+                <w:highlight w:val="yellow"/>
               </w:rPr>
               <w:t>El sitio web dispone de tres páginas web operativas a las que se puede acceder:</w:t>
             </w:r>
@@ -1305,11 +1310,13 @@
               </w:numPr>
               <w:rPr>
                 <w:color w:val="0E101A"/>
-              </w:rPr>
-            </w:pPr>
-            <w:r>
-              <w:rPr>
-                <w:color w:val="0E101A"/>
+                <w:highlight w:val="yellow"/>
+              </w:rPr>
+            </w:pPr>
+            <w:r>
+              <w:rPr>
+                <w:color w:val="0E101A"/>
+                <w:highlight w:val="yellow"/>
               </w:rPr>
               <w:t>La página "de inicio"</w:t>
             </w:r>
@@ -1322,11 +1329,13 @@
               </w:numPr>
               <w:rPr>
                 <w:color w:val="0E101A"/>
-              </w:rPr>
-            </w:pPr>
-            <w:r>
-              <w:rPr>
-                <w:color w:val="0E101A"/>
+                <w:highlight w:val="yellow"/>
+              </w:rPr>
+            </w:pPr>
+            <w:r>
+              <w:rPr>
+                <w:color w:val="0E101A"/>
+                <w:highlight w:val="yellow"/>
               </w:rPr>
               <w:t>La página "Quiénes somos"</w:t>
             </w:r>
@@ -1339,11 +1348,13 @@
               </w:numPr>
               <w:rPr>
                 <w:color w:val="0E101A"/>
-              </w:rPr>
-            </w:pPr>
-            <w:r>
-              <w:rPr>
-                <w:color w:val="0E101A"/>
+                <w:highlight w:val="yellow"/>
+              </w:rPr>
+            </w:pPr>
+            <w:r>
+              <w:rPr>
+                <w:color w:val="0E101A"/>
+                <w:highlight w:val="yellow"/>
               </w:rPr>
               <w:t>Página de "contacto"</w:t>
             </w:r>
@@ -1356,11 +1367,13 @@
               </w:numPr>
               <w:rPr>
                 <w:color w:val="0E101A"/>
-              </w:rPr>
-            </w:pPr>
-            <w:r>
-              <w:rPr>
-                <w:color w:val="0E101A"/>
+                <w:highlight w:val="yellow"/>
+              </w:rPr>
+            </w:pPr>
+            <w:r>
+              <w:rPr>
+                <w:color w:val="0E101A"/>
+                <w:highlight w:val="yellow"/>
               </w:rPr>
               <w:t>El menú de navegación debe estar siempre presente al desplazarse y en todas las páginas.</w:t>
             </w:r>
@@ -1383,12 +1396,14 @@
               <w:rPr>
                 <w:b/>
                 <w:color w:val="0E101A"/>
+                <w:highlight w:val="yellow"/>
               </w:rPr>
               <w:t>Tarea 4</w:t>
             </w:r>
             <w:r>
               <w:rPr>
                 <w:color w:val="0E101A"/>
+                <w:highlight w:val="yellow"/>
               </w:rPr>
               <w:t>: Un pie de página funcional</w:t>
             </w:r>
@@ -1401,11 +1416,13 @@
               </w:numPr>
               <w:rPr>
                 <w:color w:val="0E101A"/>
-              </w:rPr>
-            </w:pPr>
-            <w:r>
-              <w:rPr>
-                <w:color w:val="0E101A"/>
+                <w:highlight w:val="yellow"/>
+              </w:rPr>
+            </w:pPr>
+            <w:r>
+              <w:rPr>
+                <w:color w:val="0E101A"/>
+                <w:highlight w:val="yellow"/>
               </w:rPr>
               <w:t>Añada un pie de página con lo siguiente:</w:t>
             </w:r>
@@ -1418,11 +1435,13 @@
               </w:numPr>
               <w:rPr>
                 <w:color w:val="0E101A"/>
-              </w:rPr>
-            </w:pPr>
-            <w:r>
-              <w:rPr>
-                <w:color w:val="0E101A"/>
+                <w:highlight w:val="yellow"/>
+              </w:rPr>
+            </w:pPr>
+            <w:r>
+              <w:rPr>
+                <w:color w:val="0E101A"/>
+                <w:highlight w:val="yellow"/>
               </w:rPr>
               <w:t>Una lista de los autores del sitio web</w:t>
             </w:r>
@@ -1435,11 +1454,13 @@
               </w:numPr>
               <w:rPr>
                 <w:color w:val="0E101A"/>
-              </w:rPr>
-            </w:pPr>
-            <w:r>
-              <w:rPr>
-                <w:color w:val="0E101A"/>
+                <w:highlight w:val="yellow"/>
+              </w:rPr>
+            </w:pPr>
+            <w:r>
+              <w:rPr>
+                <w:color w:val="0E101A"/>
+                <w:highlight w:val="yellow"/>
               </w:rPr>
               <w:t>Correo electrónico de contacto (correo electrónico falso*)</w:t>
             </w:r>
@@ -1452,11 +1473,13 @@
               </w:numPr>
               <w:rPr>
                 <w:color w:val="0E101A"/>
-              </w:rPr>
-            </w:pPr>
-            <w:r>
-              <w:rPr>
-                <w:color w:val="0E101A"/>
+                <w:highlight w:val="yellow"/>
+              </w:rPr>
+            </w:pPr>
+            <w:r>
+              <w:rPr>
+                <w:color w:val="0E101A"/>
+                <w:highlight w:val="yellow"/>
               </w:rPr>
               <w:t>Nombre del proyecto</w:t>
             </w:r>
@@ -1469,11 +1492,13 @@
               </w:numPr>
               <w:rPr>
                 <w:color w:val="0E101A"/>
-              </w:rPr>
-            </w:pPr>
-            <w:r>
-              <w:rPr>
-                <w:color w:val="0E101A"/>
+                <w:highlight w:val="yellow"/>
+              </w:rPr>
+            </w:pPr>
+            <w:r>
+              <w:rPr>
+                <w:color w:val="0E101A"/>
+                <w:highlight w:val="yellow"/>
               </w:rPr>
               <w:t>El pie de página debe estar presente en todas las páginas web.</w:t>
             </w:r>
@@ -1490,18 +1515,21 @@
             <w:pPr>
               <w:rPr>
                 <w:color w:val="0E101A"/>
-              </w:rPr>
-            </w:pPr>
-            <w:r>
-              <w:rPr>
-                <w:b/>
-                <w:color w:val="0E101A"/>
+                <w:highlight w:val="yellow"/>
+              </w:rPr>
+            </w:pPr>
+            <w:r>
+              <w:rPr>
+                <w:b/>
+                <w:color w:val="0E101A"/>
+                <w:highlight w:val="yellow"/>
               </w:rPr>
               <w:t>Tarea 5</w:t>
             </w:r>
             <w:r>
               <w:rPr>
                 <w:color w:val="0E101A"/>
+                <w:highlight w:val="yellow"/>
               </w:rPr>
               <w:t>: La Página de Inicio</w:t>
             </w:r>
@@ -1514,11 +1542,13 @@
               </w:numPr>
               <w:rPr>
                 <w:color w:val="0E101A"/>
-              </w:rPr>
-            </w:pPr>
-            <w:r>
-              <w:rPr>
-                <w:color w:val="0E101A"/>
+                <w:highlight w:val="yellow"/>
+              </w:rPr>
+            </w:pPr>
+            <w:r>
+              <w:rPr>
+                <w:color w:val="0E101A"/>
+                <w:highlight w:val="yellow"/>
               </w:rPr>
               <w:t>Haga contenidos relacionados con el tema elegido.</w:t>
             </w:r>
@@ -1531,11 +1561,13 @@
               </w:numPr>
               <w:rPr>
                 <w:color w:val="0E101A"/>
-              </w:rPr>
-            </w:pPr>
-            <w:r>
-              <w:rPr>
-                <w:color w:val="0E101A"/>
+                <w:highlight w:val="yellow"/>
+              </w:rPr>
+            </w:pPr>
+            <w:r>
+              <w:rPr>
+                <w:color w:val="0E101A"/>
+                <w:highlight w:val="yellow"/>
               </w:rPr>
               <w:t>Escriba algún contenido relacionado con el tema utilizando las etiquetas correctas.</w:t>
             </w:r>
@@ -1548,11 +1580,13 @@
               </w:numPr>
               <w:rPr>
                 <w:color w:val="0E101A"/>
-              </w:rPr>
-            </w:pPr>
-            <w:r>
-              <w:rPr>
-                <w:color w:val="0E101A"/>
+                <w:highlight w:val="yellow"/>
+              </w:rPr>
+            </w:pPr>
+            <w:r>
+              <w:rPr>
+                <w:color w:val="0E101A"/>
+                <w:highlight w:val="yellow"/>
               </w:rPr>
               <w:t>h1 - h6</w:t>
             </w:r>
@@ -1565,11 +1599,13 @@
               </w:numPr>
               <w:rPr>
                 <w:color w:val="0E101A"/>
-              </w:rPr>
-            </w:pPr>
-            <w:r>
-              <w:rPr>
-                <w:color w:val="0E101A"/>
+                <w:highlight w:val="yellow"/>
+              </w:rPr>
+            </w:pPr>
+            <w:r>
+              <w:rPr>
+                <w:color w:val="0E101A"/>
+                <w:highlight w:val="yellow"/>
               </w:rPr>
               <w:t>p</w:t>
             </w:r>
@@ -1582,11 +1618,13 @@
               </w:numPr>
               <w:rPr>
                 <w:color w:val="0E101A"/>
-              </w:rPr>
-            </w:pPr>
-            <w:r>
-              <w:rPr>
-                <w:color w:val="0E101A"/>
+                <w:highlight w:val="yellow"/>
+              </w:rPr>
+            </w:pPr>
+            <w:r>
+              <w:rPr>
+                <w:color w:val="0E101A"/>
+                <w:highlight w:val="yellow"/>
               </w:rPr>
               <w:t>Inserte imágenes para hacer el contenido más interesante.</w:t>
             </w:r>
@@ -1599,12 +1637,14 @@
               </w:numPr>
               <w:rPr>
                 <w:color w:val="0E101A"/>
+                <w:highlight w:val="yellow"/>
               </w:rPr>
             </w:pPr>
             <w:proofErr w:type="spellStart"/>
             <w:r>
               <w:rPr>
                 <w:color w:val="0E101A"/>
+                <w:highlight w:val="yellow"/>
               </w:rPr>
               <w:t>img</w:t>
             </w:r>
@@ -1618,11 +1658,13 @@
               </w:numPr>
               <w:rPr>
                 <w:color w:val="0E101A"/>
-              </w:rPr>
-            </w:pPr>
-            <w:r>
-              <w:rPr>
-                <w:color w:val="0E101A"/>
+                <w:highlight w:val="yellow"/>
+              </w:rPr>
+            </w:pPr>
+            <w:r>
+              <w:rPr>
+                <w:color w:val="0E101A"/>
+                <w:highlight w:val="yellow"/>
               </w:rPr>
               <w:t>Estilice el sitio web con CSS para que las imágenes y el contenido escrito resulten más interesantes.</w:t>
             </w:r>
@@ -1635,11 +1677,13 @@
               </w:numPr>
               <w:rPr>
                 <w:color w:val="0E101A"/>
-              </w:rPr>
-            </w:pPr>
-            <w:r>
-              <w:rPr>
-                <w:color w:val="0E101A"/>
+                <w:highlight w:val="yellow"/>
+              </w:rPr>
+            </w:pPr>
+            <w:r>
+              <w:rPr>
+                <w:color w:val="0E101A"/>
+                <w:highlight w:val="yellow"/>
               </w:rPr>
               <w:lastRenderedPageBreak/>
               <w:t>Ejemplo: Haga paráfrasis escritas en el lado izquierdo y añada imágenes en el derecho para apoyar su contenido. Añada algo de color al fondo.</w:t>
@@ -2300,6 +2344,119 @@
     </w:lvl>
   </w:abstractNum>
   <w:abstractNum w:abstractNumId="3" w15:restartNumberingAfterBreak="0">
+    <w:nsid w:val="4BC4655F"/>
+    <w:multiLevelType w:val="hybridMultilevel"/>
+    <w:tmpl w:val="939410D8"/>
+    <w:lvl w:ilvl="0" w:tplc="04090001">
+      <w:start w:val="1"/>
+      <w:numFmt w:val="bullet"/>
+      <w:lvlText w:val=""/>
+      <w:lvlJc w:val="left"/>
+      <w:pPr>
+        <w:ind w:left="720" w:hanging="360"/>
+      </w:pPr>
+      <w:rPr>
+        <w:rFonts w:ascii="Symbol" w:hAnsi="Symbol" w:hint="default"/>
+      </w:rPr>
+    </w:lvl>
+    <w:lvl w:ilvl="1" w:tplc="04090003" w:tentative="1">
+      <w:start w:val="1"/>
+      <w:numFmt w:val="bullet"/>
+      <w:lvlText w:val="o"/>
+      <w:lvlJc w:val="left"/>
+      <w:pPr>
+        <w:ind w:left="1440" w:hanging="360"/>
+      </w:pPr>
+      <w:rPr>
+        <w:rFonts w:ascii="Courier New" w:hAnsi="Courier New" w:cs="Courier New" w:hint="default"/>
+      </w:rPr>
+    </w:lvl>
+    <w:lvl w:ilvl="2" w:tplc="04090005" w:tentative="1">
+      <w:start w:val="1"/>
+      <w:numFmt w:val="bullet"/>
+      <w:lvlText w:val=""/>
+      <w:lvlJc w:val="left"/>
+      <w:pPr>
+        <w:ind w:left="2160" w:hanging="360"/>
+      </w:pPr>
+      <w:rPr>
+        <w:rFonts w:ascii="Wingdings" w:hAnsi="Wingdings" w:hint="default"/>
+      </w:rPr>
+    </w:lvl>
+    <w:lvl w:ilvl="3" w:tplc="04090001" w:tentative="1">
+      <w:start w:val="1"/>
+      <w:numFmt w:val="bullet"/>
+      <w:lvlText w:val=""/>
+      <w:lvlJc w:val="left"/>
+      <w:pPr>
+        <w:ind w:left="2880" w:hanging="360"/>
+      </w:pPr>
+      <w:rPr>
+        <w:rFonts w:ascii="Symbol" w:hAnsi="Symbol" w:hint="default"/>
+      </w:rPr>
+    </w:lvl>
+    <w:lvl w:ilvl="4" w:tplc="04090003" w:tentative="1">
+      <w:start w:val="1"/>
+      <w:numFmt w:val="bullet"/>
+      <w:lvlText w:val="o"/>
+      <w:lvlJc w:val="left"/>
+      <w:pPr>
+        <w:ind w:left="3600" w:hanging="360"/>
+      </w:pPr>
+      <w:rPr>
+        <w:rFonts w:ascii="Courier New" w:hAnsi="Courier New" w:cs="Courier New" w:hint="default"/>
+      </w:rPr>
+    </w:lvl>
+    <w:lvl w:ilvl="5" w:tplc="04090005" w:tentative="1">
+      <w:start w:val="1"/>
+      <w:numFmt w:val="bullet"/>
+      <w:lvlText w:val=""/>
+      <w:lvlJc w:val="left"/>
+      <w:pPr>
+        <w:ind w:left="4320" w:hanging="360"/>
+      </w:pPr>
+      <w:rPr>
+        <w:rFonts w:ascii="Wingdings" w:hAnsi="Wingdings" w:hint="default"/>
+      </w:rPr>
+    </w:lvl>
+    <w:lvl w:ilvl="6" w:tplc="04090001" w:tentative="1">
+      <w:start w:val="1"/>
+      <w:numFmt w:val="bullet"/>
+      <w:lvlText w:val=""/>
+      <w:lvlJc w:val="left"/>
+      <w:pPr>
+        <w:ind w:left="5040" w:hanging="360"/>
+      </w:pPr>
+      <w:rPr>
+        <w:rFonts w:ascii="Symbol" w:hAnsi="Symbol" w:hint="default"/>
+      </w:rPr>
+    </w:lvl>
+    <w:lvl w:ilvl="7" w:tplc="04090003" w:tentative="1">
+      <w:start w:val="1"/>
+      <w:numFmt w:val="bullet"/>
+      <w:lvlText w:val="o"/>
+      <w:lvlJc w:val="left"/>
+      <w:pPr>
+        <w:ind w:left="5760" w:hanging="360"/>
+      </w:pPr>
+      <w:rPr>
+        <w:rFonts w:ascii="Courier New" w:hAnsi="Courier New" w:cs="Courier New" w:hint="default"/>
+      </w:rPr>
+    </w:lvl>
+    <w:lvl w:ilvl="8" w:tplc="04090005" w:tentative="1">
+      <w:start w:val="1"/>
+      <w:numFmt w:val="bullet"/>
+      <w:lvlText w:val=""/>
+      <w:lvlJc w:val="left"/>
+      <w:pPr>
+        <w:ind w:left="6480" w:hanging="360"/>
+      </w:pPr>
+      <w:rPr>
+        <w:rFonts w:ascii="Wingdings" w:hAnsi="Wingdings" w:hint="default"/>
+      </w:rPr>
+    </w:lvl>
+  </w:abstractNum>
+  <w:abstractNum w:abstractNumId="4" w15:restartNumberingAfterBreak="0">
     <w:nsid w:val="4CB6362D"/>
     <w:multiLevelType w:val="multilevel"/>
     <w:tmpl w:val="3738D36E"/>
@@ -2412,7 +2569,7 @@
       </w:rPr>
     </w:lvl>
   </w:abstractNum>
-  <w:abstractNum w:abstractNumId="4" w15:restartNumberingAfterBreak="0">
+  <w:abstractNum w:abstractNumId="5" w15:restartNumberingAfterBreak="0">
     <w:nsid w:val="4F4018A7"/>
     <w:multiLevelType w:val="multilevel"/>
     <w:tmpl w:val="F588EA52"/>
@@ -2525,7 +2682,7 @@
       </w:rPr>
     </w:lvl>
   </w:abstractNum>
-  <w:abstractNum w:abstractNumId="5" w15:restartNumberingAfterBreak="0">
+  <w:abstractNum w:abstractNumId="6" w15:restartNumberingAfterBreak="0">
     <w:nsid w:val="5A7210C6"/>
     <w:multiLevelType w:val="multilevel"/>
     <w:tmpl w:val="7C24DB50"/>
@@ -2638,7 +2795,7 @@
       </w:rPr>
     </w:lvl>
   </w:abstractNum>
-  <w:abstractNum w:abstractNumId="6" w15:restartNumberingAfterBreak="0">
+  <w:abstractNum w:abstractNumId="7" w15:restartNumberingAfterBreak="0">
     <w:nsid w:val="5E7D1CDA"/>
     <w:multiLevelType w:val="multilevel"/>
     <w:tmpl w:val="FBCEAE34"/>
@@ -2751,7 +2908,7 @@
       </w:rPr>
     </w:lvl>
   </w:abstractNum>
-  <w:abstractNum w:abstractNumId="7" w15:restartNumberingAfterBreak="0">
+  <w:abstractNum w:abstractNumId="8" w15:restartNumberingAfterBreak="0">
     <w:nsid w:val="69687DBA"/>
     <w:multiLevelType w:val="multilevel"/>
     <w:tmpl w:val="1BC6D716"/>
@@ -2864,7 +3021,7 @@
       </w:rPr>
     </w:lvl>
   </w:abstractNum>
-  <w:abstractNum w:abstractNumId="8" w15:restartNumberingAfterBreak="0">
+  <w:abstractNum w:abstractNumId="9" w15:restartNumberingAfterBreak="0">
     <w:nsid w:val="76C07E56"/>
     <w:multiLevelType w:val="multilevel"/>
     <w:tmpl w:val="17628A7A"/>
@@ -2978,16 +3135,16 @@
     </w:lvl>
   </w:abstractNum>
   <w:num w:numId="1" w16cid:durableId="1010959175">
-    <w:abstractNumId w:val="4"/>
+    <w:abstractNumId w:val="5"/>
   </w:num>
   <w:num w:numId="2" w16cid:durableId="1170868592">
-    <w:abstractNumId w:val="5"/>
+    <w:abstractNumId w:val="6"/>
   </w:num>
   <w:num w:numId="3" w16cid:durableId="626547146">
     <w:abstractNumId w:val="1"/>
   </w:num>
   <w:num w:numId="4" w16cid:durableId="1325816313">
-    <w:abstractNumId w:val="7"/>
+    <w:abstractNumId w:val="8"/>
   </w:num>
   <w:num w:numId="5" w16cid:durableId="231819377">
     <w:abstractNumId w:val="2"/>
@@ -2996,13 +3153,16 @@
     <w:abstractNumId w:val="0"/>
   </w:num>
   <w:num w:numId="7" w16cid:durableId="1080251831">
-    <w:abstractNumId w:val="3"/>
+    <w:abstractNumId w:val="4"/>
   </w:num>
   <w:num w:numId="8" w16cid:durableId="1912546331">
-    <w:abstractNumId w:val="6"/>
+    <w:abstractNumId w:val="7"/>
   </w:num>
   <w:num w:numId="9" w16cid:durableId="165945744">
-    <w:abstractNumId w:val="8"/>
+    <w:abstractNumId w:val="9"/>
+  </w:num>
+  <w:num w:numId="10" w16cid:durableId="1968702415">
+    <w:abstractNumId w:val="3"/>
   </w:num>
 </w:numbering>
 </file>
@@ -3642,6 +3802,17 @@
       </w:tblCellMar>
     </w:tblPr>
   </w:style>
+  <w:style w:type="paragraph" w:styleId="ListParagraph">
+    <w:name w:val="List Paragraph"/>
+    <w:basedOn w:val="Normal"/>
+    <w:uiPriority w:val="34"/>
+    <w:qFormat/>
+    <w:rsid w:val="00A735D7"/>
+    <w:pPr>
+      <w:ind w:left="720"/>
+      <w:contextualSpacing/>
+    </w:pPr>
+  </w:style>
 </w:styles>
 </file>
 

</xml_diff>